<commit_message>
Job coordinator: no invented name, make clear the role is unfilled
"Dana Ruiz" was a made-up coordinator name that read as a real staff
member. Prototypes now show [Coordinator name], and docs and code say
"the job coordinator". The routing doc, onboarding roadmap (md, Word,
PDF) and prototype start page say nobody holds the role yet and that
Abe decides who does. The sample installer owner "Dana Whitfield" is
renamed Jordan Whitfield so the name doesn't come up twice.

Co-Authored-By: Claude Opus 5.5 <noreply@anthropic.com>
Claude-Session: https://claude.ai/code/session_011N1xK637nL2JzBNb5u15KP
</commit_message>
<xml_diff>
--- a/docs/Onboarding Call Roadmap - Abe Gold (detailed).docx
+++ b/docs/Onboarding Call Roadmap - Abe Gold (detailed).docx
@@ -2675,13 +2675,13 @@
           <w:bCs/>
           <w:b/>
         </w:rPr>
-        <w:t xml:space="preserve">Who handles quote requests, installer job packets and WhatsApp confirmations:</w:t>
-      </w:r>
-      <w:r>
-        <w:t xml:space="preserve"> </w:t>
-      </w:r>
-      <w:r>
-        <w:t xml:space="preserve">the person who will forward jobs to installers.</w:t>
+        <w:t>Who will be the job coordinator:</w:t>
+      </w:r>
+      <w:r>
+        <w:t xml:space="preserve"> </w:t>
+      </w:r>
+      <w:r>
+        <w:t>the person who handles quote requests, sends job packets to installers, checks flagged prices, calls customers when no installer prices, and sends WhatsApp confirmations. Nobody is in this role yet; the prototypes show [Coordinator name] as a placeholder. An existing team member, or a new hire once job volume needs one?</w:t>
       </w:r>
     </w:p>
     <w:p>

</xml_diff>

<commit_message>
We run the job coordinator role at first; start page lists the call agenda
- Agreed: we handle the job coordinator role for the first months,
  until leads come in regularly and the work outgrows the SEO scope;
  then it moves to Abe's team or a hire. Recorded in CLAUDE.md, the
  job-routing doc and the onboarding roadmap (md, Word, PDF).
- The prototype's "What we need from you" becomes "To discuss on our
  call": the coordinator arrangement, labels, payment, pilot area,
  trade pricing, PO release, Marc keeping area and installer on quote
  requests, and the lawyer reviewing routing and price ordering.

Co-Authored-By: Claude Opus 5.5 <noreply@anthropic.com>
Claude-Session: https://claude.ai/code/session_011N1xK637nL2JzBNb5u15KP
</commit_message>
<xml_diff>
--- a/docs/Onboarding Call Roadmap - Abe Gold (detailed).docx
+++ b/docs/Onboarding Call Roadmap - Abe Gold (detailed).docx
@@ -2685,13 +2685,13 @@
           <w:bCs/>
           <w:b/>
         </w:rPr>
-        <w:t>Who will be the job coordinator:</w:t>
-      </w:r>
-      <w:r>
-        <w:t xml:space="preserve"> </w:t>
-      </w:r>
-      <w:r>
-        <w:t>the person who handles quote requests, sends job packets to installers, checks flagged prices, calls customers when no installer prices, and sends WhatsApp confirmations. Nobody is in this role yet; the prototypes show [Coordinator name] as a placeholder. An existing team member, or a new hire once job volume needs one?</w:t>
+        <w:t>Job coordinator handover:</w:t>
+      </w:r>
+      <w:r>
+        <w:t xml:space="preserve"> </w:t>
+      </w:r>
+      <w:r>
+        <w:t>we run the role (quote requests, job packets to installers, flagged prices, calls when no installer prices, WhatsApp confirmations) for the first months, until leads come in regularly and it outgrows the SEO scope. Agree who on his side takes it over then, and the lead volume that triggers the handover.</w:t>
       </w:r>
     </w:p>
     <w:p>

</xml_diff>